<commit_message>
adding the modified files
</commit_message>
<xml_diff>
--- a/python_for_devops/documentation.docx
+++ b/python_for_devops/documentation.docx
@@ -8,7 +8,7 @@
           <w:noProof/>
         </w:rPr>
         <w:drawing>
-          <wp:inline distT="0" distB="0" distL="0" distR="0" wp14:anchorId="499F79EC" wp14:editId="02DD15C0">
+          <wp:inline distT="0" distB="0" distL="0" distR="0" wp14:anchorId="499F79EC" wp14:editId="64F0CE7A">
             <wp:extent cx="5731510" cy="2919095"/>
             <wp:effectExtent l="0" t="0" r="2540" b="0"/>
             <wp:docPr id="1164294794" name="Picture 2"/>
@@ -23,7 +23,7 @@
                     <pic:cNvPicPr/>
                   </pic:nvPicPr>
                   <pic:blipFill>
-                    <a:blip r:embed="rId4" cstate="print">
+                    <a:blip r:embed="rId5" cstate="print">
                       <a:extLst>
                         <a:ext uri="{28A0092B-C50C-407E-A947-70E740481C1C}">
                           <a14:useLocalDpi xmlns:a14="http://schemas.microsoft.com/office/drawing/2010/main" val="0"/>
@@ -50,6 +50,1541 @@
         </w:drawing>
       </w:r>
     </w:p>
+    <w:p/>
+    <w:p>
+      <w:pPr>
+        <w:rPr>
+          <w:b/>
+          <w:bCs/>
+          <w:sz w:val="32"/>
+          <w:szCs w:val="32"/>
+          <w:u w:val="single"/>
+        </w:rPr>
+      </w:pPr>
+      <w:r>
+        <w:rPr>
+          <w:b/>
+          <w:bCs/>
+          <w:sz w:val="32"/>
+          <w:szCs w:val="32"/>
+          <w:u w:val="single"/>
+        </w:rPr>
+        <w:t>SQS and Encryption</w:t>
+      </w:r>
+    </w:p>
+    <w:p>
+      <w:pPr>
+        <w:rPr>
+          <w:b/>
+          <w:bCs/>
+          <w:sz w:val="32"/>
+          <w:szCs w:val="32"/>
+          <w:u w:val="single"/>
+        </w:rPr>
+      </w:pPr>
+      <w:r>
+        <w:rPr>
+          <w:b/>
+          <w:bCs/>
+          <w:noProof/>
+          <w:sz w:val="32"/>
+          <w:szCs w:val="32"/>
+          <w:u w:val="single"/>
+        </w:rPr>
+        <w:drawing>
+          <wp:inline distT="0" distB="0" distL="0" distR="0" wp14:anchorId="75E9B6EF" wp14:editId="31D37DD2">
+            <wp:extent cx="5731510" cy="2464435"/>
+            <wp:effectExtent l="0" t="0" r="2540" b="0"/>
+            <wp:docPr id="502167108" name="Picture 2"/>
+            <wp:cNvGraphicFramePr>
+              <a:graphicFrameLocks xmlns:a="http://schemas.openxmlformats.org/drawingml/2006/main" noChangeAspect="1"/>
+            </wp:cNvGraphicFramePr>
+            <a:graphic xmlns:a="http://schemas.openxmlformats.org/drawingml/2006/main">
+              <a:graphicData uri="http://schemas.openxmlformats.org/drawingml/2006/picture">
+                <pic:pic xmlns:pic="http://schemas.openxmlformats.org/drawingml/2006/picture">
+                  <pic:nvPicPr>
+                    <pic:cNvPr id="502167108" name="Picture 502167108"/>
+                    <pic:cNvPicPr/>
+                  </pic:nvPicPr>
+                  <pic:blipFill>
+                    <a:blip r:embed="rId6">
+                      <a:extLst>
+                        <a:ext uri="{28A0092B-C50C-407E-A947-70E740481C1C}">
+                          <a14:useLocalDpi xmlns:a14="http://schemas.microsoft.com/office/drawing/2010/main" val="0"/>
+                        </a:ext>
+                      </a:extLst>
+                    </a:blip>
+                    <a:stretch>
+                      <a:fillRect/>
+                    </a:stretch>
+                  </pic:blipFill>
+                  <pic:spPr>
+                    <a:xfrm>
+                      <a:off x="0" y="0"/>
+                      <a:ext cx="5731510" cy="2464435"/>
+                    </a:xfrm>
+                    <a:prstGeom prst="rect">
+                      <a:avLst/>
+                    </a:prstGeom>
+                  </pic:spPr>
+                </pic:pic>
+              </a:graphicData>
+            </a:graphic>
+          </wp:inline>
+        </w:drawing>
+      </w:r>
+    </w:p>
+    <w:p>
+      <w:pPr>
+        <w:rPr>
+          <w:b/>
+          <w:bCs/>
+          <w:sz w:val="32"/>
+          <w:szCs w:val="32"/>
+          <w:u w:val="single"/>
+        </w:rPr>
+      </w:pPr>
+    </w:p>
+    <w:p>
+      <w:pPr>
+        <w:rPr>
+          <w:b/>
+          <w:bCs/>
+          <w:sz w:val="32"/>
+          <w:szCs w:val="32"/>
+          <w:u w:val="single"/>
+        </w:rPr>
+      </w:pPr>
+      <w:r>
+        <w:rPr>
+          <w:b/>
+          <w:bCs/>
+          <w:noProof/>
+          <w:sz w:val="32"/>
+          <w:szCs w:val="32"/>
+          <w:u w:val="single"/>
+        </w:rPr>
+        <w:drawing>
+          <wp:inline distT="0" distB="0" distL="0" distR="0" wp14:anchorId="66CABCCE" wp14:editId="61390E92">
+            <wp:extent cx="5731510" cy="1879600"/>
+            <wp:effectExtent l="0" t="0" r="2540" b="6350"/>
+            <wp:docPr id="848388793" name="Picture 1"/>
+            <wp:cNvGraphicFramePr>
+              <a:graphicFrameLocks xmlns:a="http://schemas.openxmlformats.org/drawingml/2006/main" noChangeAspect="1"/>
+            </wp:cNvGraphicFramePr>
+            <a:graphic xmlns:a="http://schemas.openxmlformats.org/drawingml/2006/main">
+              <a:graphicData uri="http://schemas.openxmlformats.org/drawingml/2006/picture">
+                <pic:pic xmlns:pic="http://schemas.openxmlformats.org/drawingml/2006/picture">
+                  <pic:nvPicPr>
+                    <pic:cNvPr id="848388793" name="Picture 848388793"/>
+                    <pic:cNvPicPr/>
+                  </pic:nvPicPr>
+                  <pic:blipFill>
+                    <a:blip r:embed="rId7" cstate="print">
+                      <a:extLst>
+                        <a:ext uri="{28A0092B-C50C-407E-A947-70E740481C1C}">
+                          <a14:useLocalDpi xmlns:a14="http://schemas.microsoft.com/office/drawing/2010/main" val="0"/>
+                        </a:ext>
+                      </a:extLst>
+                    </a:blip>
+                    <a:stretch>
+                      <a:fillRect/>
+                    </a:stretch>
+                  </pic:blipFill>
+                  <pic:spPr>
+                    <a:xfrm>
+                      <a:off x="0" y="0"/>
+                      <a:ext cx="5731510" cy="1879600"/>
+                    </a:xfrm>
+                    <a:prstGeom prst="rect">
+                      <a:avLst/>
+                    </a:prstGeom>
+                  </pic:spPr>
+                </pic:pic>
+              </a:graphicData>
+            </a:graphic>
+          </wp:inline>
+        </w:drawing>
+      </w:r>
+    </w:p>
+    <w:p>
+      <w:pPr>
+        <w:rPr>
+          <w:b/>
+          <w:bCs/>
+          <w:sz w:val="32"/>
+          <w:szCs w:val="32"/>
+          <w:u w:val="single"/>
+        </w:rPr>
+      </w:pPr>
+    </w:p>
+    <w:p>
+      <w:r>
+        <w:t>When using boto3, if we need to check the encryption status of a queue</w:t>
+      </w:r>
+      <w:r>
+        <w:t xml:space="preserve">, the you need the data of the attribute </w:t>
+      </w:r>
+      <w:r>
+        <w:rPr>
+          <w:b/>
+          <w:bCs/>
+          <w:i/>
+          <w:iCs/>
+          <w:sz w:val="24"/>
+          <w:szCs w:val="24"/>
+        </w:rPr>
+        <w:t>KmsMasterKeyId</w:t>
+      </w:r>
+      <w:r>
+        <w:rPr>
+          <w:b/>
+          <w:bCs/>
+          <w:i/>
+          <w:iCs/>
+          <w:sz w:val="24"/>
+          <w:szCs w:val="24"/>
+        </w:rPr>
+        <w:t xml:space="preserve">, </w:t>
+      </w:r>
+      <w:r>
+        <w:rPr>
+          <w:sz w:val="24"/>
+          <w:szCs w:val="24"/>
+        </w:rPr>
+        <w:t>to see the type of encryption enabled.</w:t>
+      </w:r>
+    </w:p>
+    <w:p>
+      <w:pPr>
+        <w:rPr>
+          <w:sz w:val="24"/>
+          <w:szCs w:val="24"/>
+        </w:rPr>
+      </w:pPr>
+      <w:r>
+        <w:rPr>
+          <w:sz w:val="24"/>
+          <w:szCs w:val="24"/>
+        </w:rPr>
+        <w:t xml:space="preserve">While creating queue in SQS, for security purposes, we enable Server Side Encryption (SSE). There are </w:t>
+      </w:r>
+      <w:r>
+        <w:rPr>
+          <w:b/>
+          <w:bCs/>
+          <w:sz w:val="24"/>
+          <w:szCs w:val="24"/>
+        </w:rPr>
+        <w:t>two different SSE modes</w:t>
+      </w:r>
+      <w:r>
+        <w:rPr>
+          <w:sz w:val="24"/>
+          <w:szCs w:val="24"/>
+        </w:rPr>
+        <w:t xml:space="preserve"> in SQS</w:t>
+      </w:r>
+      <w:r>
+        <w:rPr>
+          <w:sz w:val="24"/>
+          <w:szCs w:val="24"/>
+        </w:rPr>
+        <w:t>:</w:t>
+      </w:r>
+    </w:p>
+    <w:p>
+      <w:pPr>
+        <w:pStyle w:val="ListParagraph"/>
+        <w:numPr>
+          <w:ilvl w:val="0"/>
+          <w:numId w:val="1"/>
+        </w:numPr>
+        <w:rPr>
+          <w:sz w:val="24"/>
+          <w:szCs w:val="24"/>
+        </w:rPr>
+      </w:pPr>
+      <w:r>
+        <w:rPr>
+          <w:sz w:val="24"/>
+          <w:szCs w:val="24"/>
+        </w:rPr>
+        <w:t>Customer</w:t>
+      </w:r>
+      <w:r>
+        <w:rPr>
+          <w:sz w:val="24"/>
+          <w:szCs w:val="24"/>
+        </w:rPr>
+        <w:t xml:space="preserve"> </w:t>
+      </w:r>
+      <w:r>
+        <w:rPr>
+          <w:sz w:val="24"/>
+          <w:szCs w:val="24"/>
+        </w:rPr>
+        <w:t>managed or AWS-managed KMS key (SSE-KMS</w:t>
+      </w:r>
+      <w:r>
+        <w:rPr>
+          <w:sz w:val="24"/>
+          <w:szCs w:val="24"/>
+        </w:rPr>
+        <w:t>)</w:t>
+      </w:r>
+    </w:p>
+    <w:p>
+      <w:pPr>
+        <w:pStyle w:val="ListParagraph"/>
+        <w:numPr>
+          <w:ilvl w:val="1"/>
+          <w:numId w:val="1"/>
+        </w:numPr>
+      </w:pPr>
+      <w:r>
+        <w:rPr>
+          <w:sz w:val="24"/>
+          <w:szCs w:val="24"/>
+        </w:rPr>
+        <w:t xml:space="preserve">If it uses </w:t>
+      </w:r>
+      <w:r>
+        <w:rPr>
+          <w:sz w:val="24"/>
+          <w:szCs w:val="24"/>
+        </w:rPr>
+        <w:t>AWS</w:t>
+      </w:r>
+      <w:r>
+        <w:rPr>
+          <w:sz w:val="24"/>
+          <w:szCs w:val="24"/>
+        </w:rPr>
+        <w:t xml:space="preserve"> managed key -- </w:t>
+      </w:r>
+      <w:r>
+        <w:t>then you will see:</w:t>
+      </w:r>
+      <w:r>
+        <w:rPr>
+          <w:sz w:val="24"/>
+          <w:szCs w:val="24"/>
+        </w:rPr>
+        <w:t>"KmsMasterKeyId": "alias/aws/sqs"</w:t>
+      </w:r>
+    </w:p>
+    <w:p>
+      <w:pPr>
+        <w:ind w:left="1080"/>
+        <w:rPr>
+          <w:sz w:val="24"/>
+          <w:szCs w:val="24"/>
+        </w:rPr>
+      </w:pPr>
+      <w:r>
+        <w:rPr>
+          <w:noProof/>
+        </w:rPr>
+        <w:drawing>
+          <wp:inline distT="0" distB="0" distL="0" distR="0" wp14:anchorId="7456668E" wp14:editId="34B3620C">
+            <wp:extent cx="5731510" cy="422910"/>
+            <wp:effectExtent l="0" t="0" r="2540" b="0"/>
+            <wp:docPr id="2112406179" name="Picture 1"/>
+            <wp:cNvGraphicFramePr>
+              <a:graphicFrameLocks xmlns:a="http://schemas.openxmlformats.org/drawingml/2006/main" noChangeAspect="1"/>
+            </wp:cNvGraphicFramePr>
+            <a:graphic xmlns:a="http://schemas.openxmlformats.org/drawingml/2006/main">
+              <a:graphicData uri="http://schemas.openxmlformats.org/drawingml/2006/picture">
+                <pic:pic xmlns:pic="http://schemas.openxmlformats.org/drawingml/2006/picture">
+                  <pic:nvPicPr>
+                    <pic:cNvPr id="2112406179" name=""/>
+                    <pic:cNvPicPr/>
+                  </pic:nvPicPr>
+                  <pic:blipFill>
+                    <a:blip r:embed="rId8"/>
+                    <a:stretch>
+                      <a:fillRect/>
+                    </a:stretch>
+                  </pic:blipFill>
+                  <pic:spPr>
+                    <a:xfrm>
+                      <a:off x="0" y="0"/>
+                      <a:ext cx="5731510" cy="422910"/>
+                    </a:xfrm>
+                    <a:prstGeom prst="rect">
+                      <a:avLst/>
+                    </a:prstGeom>
+                  </pic:spPr>
+                </pic:pic>
+              </a:graphicData>
+            </a:graphic>
+          </wp:inline>
+        </w:drawing>
+      </w:r>
+    </w:p>
+    <w:p>
+      <w:pPr>
+        <w:pStyle w:val="ListParagraph"/>
+        <w:numPr>
+          <w:ilvl w:val="1"/>
+          <w:numId w:val="1"/>
+        </w:numPr>
+        <w:rPr>
+          <w:sz w:val="20"/>
+          <w:szCs w:val="20"/>
+        </w:rPr>
+      </w:pPr>
+      <w:r>
+        <w:rPr>
+          <w:sz w:val="20"/>
+          <w:szCs w:val="20"/>
+        </w:rPr>
+        <w:t>If it uses customer managed key – you see – "KmsMasterKeyId": "arn:aws:kms:..."</w:t>
+      </w:r>
+    </w:p>
+    <w:p>
+      <w:pPr>
+        <w:rPr>
+          <w:sz w:val="24"/>
+          <w:szCs w:val="24"/>
+        </w:rPr>
+      </w:pPr>
+    </w:p>
+    <w:p>
+      <w:pPr>
+        <w:pStyle w:val="ListParagraph"/>
+        <w:numPr>
+          <w:ilvl w:val="0"/>
+          <w:numId w:val="1"/>
+        </w:numPr>
+        <w:rPr>
+          <w:sz w:val="24"/>
+          <w:szCs w:val="24"/>
+        </w:rPr>
+      </w:pPr>
+      <w:r>
+        <w:rPr>
+          <w:b/>
+          <w:bCs/>
+          <w:sz w:val="24"/>
+          <w:szCs w:val="24"/>
+        </w:rPr>
+        <w:t>SSE-SQS</w:t>
+      </w:r>
+      <w:r>
+        <w:rPr>
+          <w:sz w:val="24"/>
+          <w:szCs w:val="24"/>
+        </w:rPr>
+        <w:t xml:space="preserve"> (SQS</w:t>
+      </w:r>
+      <w:r>
+        <w:rPr>
+          <w:sz w:val="24"/>
+          <w:szCs w:val="24"/>
+        </w:rPr>
+        <w:t xml:space="preserve"> </w:t>
+      </w:r>
+      <w:r>
+        <w:rPr>
+          <w:sz w:val="24"/>
+          <w:szCs w:val="24"/>
+        </w:rPr>
+        <w:t>owned</w:t>
+      </w:r>
+      <w:r>
+        <w:rPr>
+          <w:sz w:val="24"/>
+          <w:szCs w:val="24"/>
+        </w:rPr>
+        <w:t xml:space="preserve"> </w:t>
+      </w:r>
+      <w:r>
+        <w:rPr>
+          <w:sz w:val="24"/>
+          <w:szCs w:val="24"/>
+        </w:rPr>
+        <w:t>encryption keys)</w:t>
+      </w:r>
+    </w:p>
+    <w:p>
+      <w:pPr>
+        <w:ind w:left="720"/>
+        <w:rPr>
+          <w:sz w:val="24"/>
+          <w:szCs w:val="24"/>
+        </w:rPr>
+      </w:pPr>
+      <w:r>
+        <w:rPr>
+          <w:sz w:val="24"/>
+          <w:szCs w:val="24"/>
+        </w:rPr>
+        <w:t xml:space="preserve">Here you wont see </w:t>
+      </w:r>
+      <w:r>
+        <w:rPr>
+          <w:sz w:val="24"/>
+          <w:szCs w:val="24"/>
+        </w:rPr>
+        <w:t>KmsMasterKeyId</w:t>
+      </w:r>
+      <w:r>
+        <w:rPr>
+          <w:sz w:val="24"/>
+          <w:szCs w:val="24"/>
+        </w:rPr>
+        <w:t xml:space="preserve"> attribute, instead, you will see another attribute</w:t>
+      </w:r>
+    </w:p>
+    <w:p>
+      <w:pPr>
+        <w:ind w:left="720"/>
+        <w:rPr>
+          <w:sz w:val="24"/>
+          <w:szCs w:val="24"/>
+        </w:rPr>
+      </w:pPr>
+      <w:r>
+        <w:rPr>
+          <w:sz w:val="24"/>
+          <w:szCs w:val="24"/>
+        </w:rPr>
+        <w:t xml:space="preserve"> </w:t>
+      </w:r>
+      <w:r>
+        <w:rPr>
+          <w:sz w:val="24"/>
+          <w:szCs w:val="24"/>
+        </w:rPr>
+        <w:t>{</w:t>
+      </w:r>
+    </w:p>
+    <w:p>
+      <w:pPr>
+        <w:ind w:left="720"/>
+        <w:rPr>
+          <w:sz w:val="24"/>
+          <w:szCs w:val="24"/>
+        </w:rPr>
+      </w:pPr>
+      <w:r>
+        <w:rPr>
+          <w:sz w:val="24"/>
+          <w:szCs w:val="24"/>
+        </w:rPr>
+        <w:t xml:space="preserve">  "SqsManagedSseEnabled": "true"</w:t>
+      </w:r>
+    </w:p>
+    <w:p>
+      <w:pPr>
+        <w:ind w:left="720"/>
+        <w:rPr>
+          <w:sz w:val="24"/>
+          <w:szCs w:val="24"/>
+        </w:rPr>
+      </w:pPr>
+      <w:r>
+        <w:rPr>
+          <w:sz w:val="24"/>
+          <w:szCs w:val="24"/>
+        </w:rPr>
+        <w:t>}</w:t>
+      </w:r>
+    </w:p>
+    <w:p>
+      <w:pPr>
+        <w:ind w:left="720"/>
+        <w:rPr>
+          <w:sz w:val="24"/>
+          <w:szCs w:val="24"/>
+        </w:rPr>
+      </w:pPr>
+      <w:r>
+        <w:rPr>
+          <w:noProof/>
+          <w:sz w:val="24"/>
+          <w:szCs w:val="24"/>
+        </w:rPr>
+        <w:drawing>
+          <wp:inline distT="0" distB="0" distL="0" distR="0" wp14:anchorId="5E6F4F4D" wp14:editId="5ECC5DD8">
+            <wp:extent cx="5731510" cy="983615"/>
+            <wp:effectExtent l="0" t="0" r="2540" b="6985"/>
+            <wp:docPr id="1882080247" name="Picture 3"/>
+            <wp:cNvGraphicFramePr>
+              <a:graphicFrameLocks xmlns:a="http://schemas.openxmlformats.org/drawingml/2006/main" noChangeAspect="1"/>
+            </wp:cNvGraphicFramePr>
+            <a:graphic xmlns:a="http://schemas.openxmlformats.org/drawingml/2006/main">
+              <a:graphicData uri="http://schemas.openxmlformats.org/drawingml/2006/picture">
+                <pic:pic xmlns:pic="http://schemas.openxmlformats.org/drawingml/2006/picture">
+                  <pic:nvPicPr>
+                    <pic:cNvPr id="1882080247" name="Picture 1882080247"/>
+                    <pic:cNvPicPr/>
+                  </pic:nvPicPr>
+                  <pic:blipFill>
+                    <a:blip r:embed="rId9" cstate="print">
+                      <a:extLst>
+                        <a:ext uri="{28A0092B-C50C-407E-A947-70E740481C1C}">
+                          <a14:useLocalDpi xmlns:a14="http://schemas.microsoft.com/office/drawing/2010/main" val="0"/>
+                        </a:ext>
+                      </a:extLst>
+                    </a:blip>
+                    <a:stretch>
+                      <a:fillRect/>
+                    </a:stretch>
+                  </pic:blipFill>
+                  <pic:spPr>
+                    <a:xfrm>
+                      <a:off x="0" y="0"/>
+                      <a:ext cx="5731510" cy="983615"/>
+                    </a:xfrm>
+                    <a:prstGeom prst="rect">
+                      <a:avLst/>
+                    </a:prstGeom>
+                  </pic:spPr>
+                </pic:pic>
+              </a:graphicData>
+            </a:graphic>
+          </wp:inline>
+        </w:drawing>
+      </w:r>
+    </w:p>
+    <w:p>
+      <w:pPr>
+        <w:ind w:left="720"/>
+        <w:rPr>
+          <w:sz w:val="24"/>
+          <w:szCs w:val="24"/>
+        </w:rPr>
+      </w:pPr>
+    </w:p>
+    <w:p>
+      <w:pPr>
+        <w:rPr>
+          <w:sz w:val="24"/>
+          <w:szCs w:val="24"/>
+        </w:rPr>
+      </w:pPr>
+    </w:p>
+    <w:p>
+      <w:pPr>
+        <w:rPr>
+          <w:b/>
+          <w:bCs/>
+          <w:sz w:val="28"/>
+          <w:szCs w:val="28"/>
+          <w:u w:val="single"/>
+        </w:rPr>
+      </w:pPr>
+      <w:r>
+        <w:rPr>
+          <w:b/>
+          <w:bCs/>
+          <w:sz w:val="28"/>
+          <w:szCs w:val="28"/>
+          <w:u w:val="single"/>
+        </w:rPr>
+        <w:t>Response codes in API response</w:t>
+      </w:r>
+    </w:p>
+    <w:p>
+      <w:pPr>
+        <w:rPr>
+          <w:sz w:val="24"/>
+          <w:szCs w:val="24"/>
+        </w:rPr>
+      </w:pPr>
+      <w:r>
+        <w:rPr>
+          <w:sz w:val="24"/>
+          <w:szCs w:val="24"/>
+        </w:rPr>
+        <w:t xml:space="preserve">while making API call to AWS from python using boto3, </w:t>
+      </w:r>
+      <w:r>
+        <w:rPr>
+          <w:sz w:val="24"/>
+          <w:szCs w:val="24"/>
+        </w:rPr>
+        <w:t xml:space="preserve">let us see about the </w:t>
+      </w:r>
+      <w:r>
+        <w:rPr>
+          <w:sz w:val="24"/>
+          <w:szCs w:val="24"/>
+        </w:rPr>
+        <w:t>various response codes and their meaning</w:t>
+      </w:r>
+      <w:r>
+        <w:rPr>
+          <w:sz w:val="24"/>
+          <w:szCs w:val="24"/>
+        </w:rPr>
+        <w:t>:</w:t>
+      </w:r>
+    </w:p>
+    <w:p>
+      <w:pPr>
+        <w:ind w:left="720"/>
+        <w:rPr>
+          <w:sz w:val="24"/>
+          <w:szCs w:val="24"/>
+        </w:rPr>
+      </w:pPr>
+      <w:r>
+        <w:rPr>
+          <w:sz w:val="24"/>
+          <w:szCs w:val="24"/>
+        </w:rPr>
+        <w:t>400 - &gt; bad/malformed request</w:t>
+      </w:r>
+    </w:p>
+    <w:p>
+      <w:pPr>
+        <w:ind w:left="720"/>
+        <w:rPr>
+          <w:sz w:val="24"/>
+          <w:szCs w:val="24"/>
+        </w:rPr>
+      </w:pPr>
+      <w:r>
+        <w:rPr>
+          <w:sz w:val="24"/>
+          <w:szCs w:val="24"/>
+        </w:rPr>
+        <w:t>401 -&gt; unauthorised -&gt; invalid/no credentials</w:t>
+      </w:r>
+    </w:p>
+    <w:p>
+      <w:pPr>
+        <w:ind w:left="720"/>
+        <w:rPr>
+          <w:sz w:val="24"/>
+          <w:szCs w:val="24"/>
+        </w:rPr>
+      </w:pPr>
+      <w:r>
+        <w:rPr>
+          <w:sz w:val="24"/>
+          <w:szCs w:val="24"/>
+        </w:rPr>
+        <w:t>403 -&gt; insufficient permissions (access denied)</w:t>
+      </w:r>
+    </w:p>
+    <w:p>
+      <w:pPr>
+        <w:ind w:left="720"/>
+        <w:rPr>
+          <w:sz w:val="24"/>
+          <w:szCs w:val="24"/>
+        </w:rPr>
+      </w:pPr>
+      <w:r>
+        <w:rPr>
+          <w:sz w:val="24"/>
+          <w:szCs w:val="24"/>
+        </w:rPr>
+        <w:t>404 -&gt; resource not found</w:t>
+      </w:r>
+    </w:p>
+    <w:p>
+      <w:pPr>
+        <w:ind w:left="720"/>
+        <w:rPr>
+          <w:sz w:val="24"/>
+          <w:szCs w:val="24"/>
+        </w:rPr>
+      </w:pPr>
+      <w:r>
+        <w:rPr>
+          <w:sz w:val="24"/>
+          <w:szCs w:val="24"/>
+        </w:rPr>
+        <w:lastRenderedPageBreak/>
+        <w:t xml:space="preserve">422 -&gt; </w:t>
+      </w:r>
+      <w:r>
+        <w:rPr>
+          <w:b/>
+          <w:bCs/>
+          <w:sz w:val="24"/>
+          <w:szCs w:val="24"/>
+        </w:rPr>
+        <w:t>Unprocessable Entity</w:t>
+      </w:r>
+      <w:r>
+        <w:rPr>
+          <w:b/>
+          <w:bCs/>
+          <w:sz w:val="24"/>
+          <w:szCs w:val="24"/>
+        </w:rPr>
+        <w:t xml:space="preserve"> -&gt; </w:t>
+      </w:r>
+      <w:r>
+        <w:rPr>
+          <w:sz w:val="24"/>
+          <w:szCs w:val="24"/>
+        </w:rPr>
+        <w:t>Well-formed request, but data fails validation rules</w:t>
+      </w:r>
+    </w:p>
+    <w:p>
+      <w:pPr>
+        <w:ind w:left="720"/>
+        <w:rPr>
+          <w:sz w:val="24"/>
+          <w:szCs w:val="24"/>
+        </w:rPr>
+      </w:pPr>
+      <w:r>
+        <w:rPr>
+          <w:sz w:val="24"/>
+          <w:szCs w:val="24"/>
+        </w:rPr>
+        <w:t>For eg – you are accessing github api endpoint to create a repo, but that repo already exists in your github account.</w:t>
+      </w:r>
+    </w:p>
+    <w:p>
+      <w:pPr>
+        <w:ind w:left="720"/>
+        <w:rPr>
+          <w:sz w:val="24"/>
+          <w:szCs w:val="24"/>
+        </w:rPr>
+      </w:pPr>
+      <w:r>
+        <w:rPr>
+          <w:sz w:val="24"/>
+          <w:szCs w:val="24"/>
+        </w:rPr>
+        <w:t>500 -&gt; AWS server failure (internal server error)</w:t>
+      </w:r>
+    </w:p>
+    <w:p>
+      <w:pPr>
+        <w:ind w:left="720"/>
+        <w:rPr>
+          <w:sz w:val="24"/>
+          <w:szCs w:val="24"/>
+        </w:rPr>
+      </w:pPr>
+      <w:r>
+        <w:rPr>
+          <w:sz w:val="24"/>
+          <w:szCs w:val="24"/>
+        </w:rPr>
+        <w:t xml:space="preserve">503 -&gt; </w:t>
+      </w:r>
+      <w:r>
+        <w:rPr>
+          <w:sz w:val="24"/>
+          <w:szCs w:val="24"/>
+        </w:rPr>
+        <w:t>Service Unavailable</w:t>
+      </w:r>
+      <w:r>
+        <w:rPr>
+          <w:sz w:val="24"/>
+          <w:szCs w:val="24"/>
+        </w:rPr>
+        <w:t xml:space="preserve">, </w:t>
+      </w:r>
+      <w:r>
+        <w:rPr>
+          <w:sz w:val="24"/>
+          <w:szCs w:val="24"/>
+        </w:rPr>
+        <w:t>AWS service temporarily down</w:t>
+      </w:r>
+    </w:p>
+    <w:p>
+      <w:pPr>
+        <w:ind w:left="720"/>
+        <w:rPr>
+          <w:sz w:val="24"/>
+          <w:szCs w:val="24"/>
+        </w:rPr>
+      </w:pPr>
+      <w:r>
+        <w:rPr>
+          <w:sz w:val="24"/>
+          <w:szCs w:val="24"/>
+        </w:rPr>
+        <w:t>409 -&gt; state conflict</w:t>
+      </w:r>
+    </w:p>
+    <w:p>
+      <w:pPr>
+        <w:ind w:left="720"/>
+        <w:rPr>
+          <w:sz w:val="24"/>
+          <w:szCs w:val="24"/>
+        </w:rPr>
+      </w:pPr>
+      <w:r>
+        <w:rPr>
+          <w:sz w:val="24"/>
+          <w:szCs w:val="24"/>
+        </w:rPr>
+        <w:t>200 -&gt; request success</w:t>
+      </w:r>
+    </w:p>
+    <w:p>
+      <w:pPr>
+        <w:ind w:left="720"/>
+        <w:rPr>
+          <w:sz w:val="24"/>
+          <w:szCs w:val="24"/>
+        </w:rPr>
+      </w:pPr>
+      <w:r>
+        <w:rPr>
+          <w:sz w:val="24"/>
+          <w:szCs w:val="24"/>
+        </w:rPr>
+        <w:t>201 -&gt; resource created successfully</w:t>
+      </w:r>
+    </w:p>
+    <w:p>
+      <w:pPr>
+        <w:ind w:left="720"/>
+        <w:rPr>
+          <w:sz w:val="24"/>
+          <w:szCs w:val="24"/>
+        </w:rPr>
+      </w:pPr>
+      <w:r>
+        <w:rPr>
+          <w:sz w:val="24"/>
+          <w:szCs w:val="24"/>
+        </w:rPr>
+        <w:t>204 -&gt; no content -&gt; therefore, s</w:t>
+      </w:r>
+      <w:r>
+        <w:rPr>
+          <w:sz w:val="24"/>
+          <w:szCs w:val="24"/>
+        </w:rPr>
+        <w:t xml:space="preserve">uccess, </w:t>
+      </w:r>
+      <w:r>
+        <w:rPr>
+          <w:sz w:val="24"/>
+          <w:szCs w:val="24"/>
+        </w:rPr>
+        <w:t xml:space="preserve">but </w:t>
+      </w:r>
+      <w:r>
+        <w:rPr>
+          <w:sz w:val="24"/>
+          <w:szCs w:val="24"/>
+        </w:rPr>
+        <w:t>no body returned</w:t>
+      </w:r>
+    </w:p>
+    <w:p>
+      <w:pPr>
+        <w:rPr>
+          <w:sz w:val="24"/>
+          <w:szCs w:val="24"/>
+        </w:rPr>
+      </w:pPr>
+    </w:p>
+    <w:p>
+      <w:pPr>
+        <w:rPr>
+          <w:b/>
+          <w:sz w:val="24"/>
+          <w:szCs w:val="24"/>
+          <w:u w:val="single"/>
+          <w:lang w:val="en-US"/>
+        </w:rPr>
+      </w:pPr>
+      <w:r>
+        <w:rPr>
+          <w:b/>
+          <w:sz w:val="24"/>
+          <w:szCs w:val="24"/>
+          <w:u w:val="single"/>
+          <w:lang w:val="en-US"/>
+        </w:rPr>
+        <w:t>Pagination output</w:t>
+      </w:r>
+    </w:p>
+    <w:p>
+      <w:pPr>
+        <w:rPr>
+          <w:bCs/>
+          <w:sz w:val="24"/>
+          <w:szCs w:val="24"/>
+          <w:lang w:val="en-US"/>
+        </w:rPr>
+      </w:pPr>
+      <w:r>
+        <w:rPr>
+          <w:bCs/>
+          <w:sz w:val="24"/>
+          <w:szCs w:val="24"/>
+          <w:lang w:val="en-US"/>
+        </w:rPr>
+        <w:drawing>
+          <wp:inline distT="0" distB="0" distL="0" distR="0" wp14:anchorId="0F3AA418" wp14:editId="2EB5B30B">
+            <wp:extent cx="5410200" cy="4133850"/>
+            <wp:effectExtent l="0" t="0" r="0" b="0"/>
+            <wp:docPr id="1520359731" name="Picture 8"/>
+            <wp:cNvGraphicFramePr>
+              <a:graphicFrameLocks xmlns:a="http://schemas.openxmlformats.org/drawingml/2006/main" noChangeAspect="1"/>
+            </wp:cNvGraphicFramePr>
+            <a:graphic xmlns:a="http://schemas.openxmlformats.org/drawingml/2006/main">
+              <a:graphicData uri="http://schemas.openxmlformats.org/drawingml/2006/picture">
+                <pic:pic xmlns:pic="http://schemas.openxmlformats.org/drawingml/2006/picture">
+                  <pic:nvPicPr>
+                    <pic:cNvPr id="0" name="Picture 3"/>
+                    <pic:cNvPicPr>
+                      <a:picLocks noChangeAspect="1" noChangeArrowheads="1"/>
+                    </pic:cNvPicPr>
+                  </pic:nvPicPr>
+                  <pic:blipFill>
+                    <a:blip r:embed="rId10">
+                      <a:extLst>
+                        <a:ext uri="{28A0092B-C50C-407E-A947-70E740481C1C}">
+                          <a14:useLocalDpi xmlns:a14="http://schemas.microsoft.com/office/drawing/2010/main" val="0"/>
+                        </a:ext>
+                      </a:extLst>
+                    </a:blip>
+                    <a:srcRect/>
+                    <a:stretch>
+                      <a:fillRect/>
+                    </a:stretch>
+                  </pic:blipFill>
+                  <pic:spPr bwMode="auto">
+                    <a:xfrm>
+                      <a:off x="0" y="0"/>
+                      <a:ext cx="5410200" cy="4133850"/>
+                    </a:xfrm>
+                    <a:prstGeom prst="rect">
+                      <a:avLst/>
+                    </a:prstGeom>
+                    <a:noFill/>
+                    <a:ln>
+                      <a:noFill/>
+                    </a:ln>
+                  </pic:spPr>
+                </pic:pic>
+              </a:graphicData>
+            </a:graphic>
+          </wp:inline>
+        </w:drawing>
+      </w:r>
+    </w:p>
+    <w:p>
+      <w:pPr>
+        <w:rPr>
+          <w:bCs/>
+          <w:sz w:val="24"/>
+          <w:szCs w:val="24"/>
+          <w:lang w:val="en-US"/>
+        </w:rPr>
+      </w:pPr>
+    </w:p>
+    <w:p>
+      <w:pPr>
+        <w:rPr>
+          <w:bCs/>
+          <w:sz w:val="24"/>
+          <w:szCs w:val="24"/>
+          <w:lang w:val="en-US"/>
+        </w:rPr>
+      </w:pPr>
+      <w:r>
+        <w:rPr>
+          <w:bCs/>
+          <w:sz w:val="24"/>
+          <w:szCs w:val="24"/>
+          <w:lang w:val="en-US"/>
+        </w:rPr>
+        <w:lastRenderedPageBreak/>
+        <w:drawing>
+          <wp:inline distT="0" distB="0" distL="0" distR="0" wp14:anchorId="57B5F134" wp14:editId="79D8FF7C">
+            <wp:extent cx="4343400" cy="4000500"/>
+            <wp:effectExtent l="0" t="0" r="0" b="0"/>
+            <wp:docPr id="571008568" name="Picture 7"/>
+            <wp:cNvGraphicFramePr>
+              <a:graphicFrameLocks xmlns:a="http://schemas.openxmlformats.org/drawingml/2006/main" noChangeAspect="1"/>
+            </wp:cNvGraphicFramePr>
+            <a:graphic xmlns:a="http://schemas.openxmlformats.org/drawingml/2006/main">
+              <a:graphicData uri="http://schemas.openxmlformats.org/drawingml/2006/picture">
+                <pic:pic xmlns:pic="http://schemas.openxmlformats.org/drawingml/2006/picture">
+                  <pic:nvPicPr>
+                    <pic:cNvPr id="0" name="Picture 5"/>
+                    <pic:cNvPicPr>
+                      <a:picLocks noChangeAspect="1" noChangeArrowheads="1"/>
+                    </pic:cNvPicPr>
+                  </pic:nvPicPr>
+                  <pic:blipFill>
+                    <a:blip r:embed="rId11">
+                      <a:extLst>
+                        <a:ext uri="{28A0092B-C50C-407E-A947-70E740481C1C}">
+                          <a14:useLocalDpi xmlns:a14="http://schemas.microsoft.com/office/drawing/2010/main" val="0"/>
+                        </a:ext>
+                      </a:extLst>
+                    </a:blip>
+                    <a:srcRect/>
+                    <a:stretch>
+                      <a:fillRect/>
+                    </a:stretch>
+                  </pic:blipFill>
+                  <pic:spPr bwMode="auto">
+                    <a:xfrm>
+                      <a:off x="0" y="0"/>
+                      <a:ext cx="4343400" cy="4000500"/>
+                    </a:xfrm>
+                    <a:prstGeom prst="rect">
+                      <a:avLst/>
+                    </a:prstGeom>
+                    <a:noFill/>
+                    <a:ln>
+                      <a:noFill/>
+                    </a:ln>
+                  </pic:spPr>
+                </pic:pic>
+              </a:graphicData>
+            </a:graphic>
+          </wp:inline>
+        </w:drawing>
+      </w:r>
+    </w:p>
+    <w:p>
+      <w:pPr>
+        <w:rPr>
+          <w:bCs/>
+          <w:sz w:val="24"/>
+          <w:szCs w:val="24"/>
+          <w:lang w:val="en-US"/>
+        </w:rPr>
+      </w:pPr>
+    </w:p>
+    <w:p>
+      <w:pPr>
+        <w:rPr>
+          <w:bCs/>
+          <w:sz w:val="24"/>
+          <w:szCs w:val="24"/>
+          <w:lang w:val="en-US"/>
+        </w:rPr>
+      </w:pPr>
+    </w:p>
+    <w:p>
+      <w:pPr>
+        <w:rPr>
+          <w:b/>
+          <w:bCs/>
+          <w:sz w:val="24"/>
+          <w:szCs w:val="24"/>
+          <w:u w:val="single"/>
+          <w:lang w:val="en-US"/>
+        </w:rPr>
+      </w:pPr>
+      <w:r>
+        <w:rPr>
+          <w:b/>
+          <w:bCs/>
+          <w:sz w:val="24"/>
+          <w:szCs w:val="24"/>
+          <w:u w:val="single"/>
+          <w:lang w:val="en-US"/>
+        </w:rPr>
+        <w:t>Headers in API call</w:t>
+      </w:r>
+    </w:p>
+    <w:p>
+      <w:pPr>
+        <w:rPr>
+          <w:sz w:val="24"/>
+          <w:szCs w:val="24"/>
+        </w:rPr>
+      </w:pPr>
+      <w:r>
+        <w:rPr>
+          <w:sz w:val="24"/>
+          <w:szCs w:val="24"/>
+        </w:rPr>
+        <w:t xml:space="preserve">headers are like the </w:t>
+      </w:r>
+      <w:r>
+        <w:rPr>
+          <w:b/>
+          <w:bCs/>
+          <w:sz w:val="24"/>
+          <w:szCs w:val="24"/>
+        </w:rPr>
+        <w:t>cover page</w:t>
+      </w:r>
+      <w:r>
+        <w:rPr>
+          <w:sz w:val="24"/>
+          <w:szCs w:val="24"/>
+        </w:rPr>
+        <w:t xml:space="preserve"> of your request that tells GitHub:</w:t>
+      </w:r>
+    </w:p>
+    <w:p>
+      <w:pPr>
+        <w:rPr>
+          <w:sz w:val="24"/>
+          <w:szCs w:val="24"/>
+        </w:rPr>
+      </w:pPr>
+      <w:r>
+        <w:rPr>
+          <w:sz w:val="24"/>
+          <w:szCs w:val="24"/>
+          <w:lang w:val="en-US"/>
+        </w:rPr>
+        <w:drawing>
+          <wp:inline distT="0" distB="0" distL="0" distR="0" wp14:anchorId="234E1D82" wp14:editId="06CECD36">
+            <wp:extent cx="3727450" cy="1219200"/>
+            <wp:effectExtent l="0" t="0" r="6350" b="0"/>
+            <wp:docPr id="297042936" name="Picture 6"/>
+            <wp:cNvGraphicFramePr>
+              <a:graphicFrameLocks xmlns:a="http://schemas.openxmlformats.org/drawingml/2006/main" noChangeAspect="1"/>
+            </wp:cNvGraphicFramePr>
+            <a:graphic xmlns:a="http://schemas.openxmlformats.org/drawingml/2006/main">
+              <a:graphicData uri="http://schemas.openxmlformats.org/drawingml/2006/picture">
+                <pic:pic xmlns:pic="http://schemas.openxmlformats.org/drawingml/2006/picture">
+                  <pic:nvPicPr>
+                    <pic:cNvPr id="0" name="Picture 6"/>
+                    <pic:cNvPicPr>
+                      <a:picLocks noChangeAspect="1" noChangeArrowheads="1"/>
+                    </pic:cNvPicPr>
+                  </pic:nvPicPr>
+                  <pic:blipFill>
+                    <a:blip r:embed="rId12">
+                      <a:extLst>
+                        <a:ext uri="{28A0092B-C50C-407E-A947-70E740481C1C}">
+                          <a14:useLocalDpi xmlns:a14="http://schemas.microsoft.com/office/drawing/2010/main" val="0"/>
+                        </a:ext>
+                      </a:extLst>
+                    </a:blip>
+                    <a:srcRect/>
+                    <a:stretch>
+                      <a:fillRect/>
+                    </a:stretch>
+                  </pic:blipFill>
+                  <pic:spPr bwMode="auto">
+                    <a:xfrm>
+                      <a:off x="0" y="0"/>
+                      <a:ext cx="3727450" cy="1219200"/>
+                    </a:xfrm>
+                    <a:prstGeom prst="rect">
+                      <a:avLst/>
+                    </a:prstGeom>
+                    <a:noFill/>
+                    <a:ln>
+                      <a:noFill/>
+                    </a:ln>
+                  </pic:spPr>
+                </pic:pic>
+              </a:graphicData>
+            </a:graphic>
+          </wp:inline>
+        </w:drawing>
+      </w:r>
+    </w:p>
+    <w:p>
+      <w:pPr>
+        <w:numPr>
+          <w:ilvl w:val="0"/>
+          <w:numId w:val="2"/>
+        </w:numPr>
+        <w:rPr>
+          <w:sz w:val="24"/>
+          <w:szCs w:val="24"/>
+          <w:lang w:val="en-US"/>
+        </w:rPr>
+      </w:pPr>
+      <w:r>
+        <w:rPr>
+          <w:sz w:val="24"/>
+          <w:szCs w:val="24"/>
+        </w:rPr>
+        <w:t>Authorization</w:t>
+      </w:r>
+    </w:p>
+    <w:p>
+      <w:pPr>
+        <w:numPr>
+          <w:ilvl w:val="0"/>
+          <w:numId w:val="2"/>
+        </w:numPr>
+        <w:rPr>
+          <w:sz w:val="24"/>
+          <w:szCs w:val="24"/>
+          <w:lang w:val="en-US"/>
+        </w:rPr>
+      </w:pPr>
+      <w:r>
+        <w:rPr>
+          <w:sz w:val="24"/>
+          <w:szCs w:val="24"/>
+        </w:rPr>
+        <w:t>Accept</w:t>
+      </w:r>
+    </w:p>
+    <w:p>
+      <w:pPr>
+        <w:numPr>
+          <w:ilvl w:val="0"/>
+          <w:numId w:val="2"/>
+        </w:numPr>
+        <w:rPr>
+          <w:sz w:val="24"/>
+          <w:szCs w:val="24"/>
+          <w:lang w:val="en-US"/>
+        </w:rPr>
+      </w:pPr>
+      <w:r>
+        <w:rPr>
+          <w:sz w:val="24"/>
+          <w:szCs w:val="24"/>
+        </w:rPr>
+        <w:t>X-GitHub-Api-Version</w:t>
+      </w:r>
+    </w:p>
+    <w:p>
+      <w:pPr>
+        <w:rPr>
+          <w:sz w:val="24"/>
+          <w:szCs w:val="24"/>
+          <w:lang w:val="en-US"/>
+        </w:rPr>
+      </w:pPr>
+    </w:p>
+    <w:p>
+      <w:pPr>
+        <w:rPr>
+          <w:sz w:val="24"/>
+          <w:szCs w:val="24"/>
+        </w:rPr>
+      </w:pPr>
+      <w:r>
+        <w:rPr>
+          <w:sz w:val="24"/>
+          <w:szCs w:val="24"/>
+          <w:lang w:val="en-US"/>
+        </w:rPr>
+        <w:t xml:space="preserve">Authorization -- </w:t>
+      </w:r>
+      <w:r>
+        <w:rPr>
+          <w:i/>
+          <w:iCs/>
+          <w:sz w:val="24"/>
+          <w:szCs w:val="24"/>
+        </w:rPr>
+        <w:t>your identity, Bearer just means "I'm proving my identity with this token"</w:t>
+      </w:r>
+    </w:p>
+    <w:p>
+      <w:pPr>
+        <w:rPr>
+          <w:sz w:val="24"/>
+          <w:szCs w:val="24"/>
+        </w:rPr>
+      </w:pPr>
+      <w:r>
+        <w:rPr>
+          <w:sz w:val="24"/>
+          <w:szCs w:val="24"/>
+          <w:lang w:val="en-US"/>
+        </w:rPr>
+        <w:t xml:space="preserve">Accept -- </w:t>
+      </w:r>
+      <w:r>
+        <w:rPr>
+          <w:i/>
+          <w:iCs/>
+          <w:sz w:val="24"/>
+          <w:szCs w:val="24"/>
+        </w:rPr>
+        <w:t>You're telling GitHub "send me the response in JSON format", vnd.github+json is GitHub's specific JSON format</w:t>
+      </w:r>
+    </w:p>
+    <w:p>
+      <w:pPr>
+        <w:rPr>
+          <w:sz w:val="24"/>
+          <w:szCs w:val="24"/>
+        </w:rPr>
+      </w:pPr>
+      <w:r>
+        <w:rPr>
+          <w:sz w:val="24"/>
+          <w:szCs w:val="24"/>
+          <w:lang w:val="en-US"/>
+        </w:rPr>
+        <w:t xml:space="preserve">Version -- </w:t>
+      </w:r>
+      <w:r>
+        <w:rPr>
+          <w:i/>
+          <w:iCs/>
+          <w:sz w:val="24"/>
+          <w:szCs w:val="24"/>
+        </w:rPr>
+        <w:t>the version of the github API to use</w:t>
+      </w:r>
+    </w:p>
+    <w:p>
+      <w:pPr>
+        <w:rPr>
+          <w:sz w:val="24"/>
+          <w:szCs w:val="24"/>
+          <w:lang w:val="en-US"/>
+        </w:rPr>
+      </w:pPr>
+    </w:p>
+    <w:p>
+      <w:pPr>
+        <w:rPr>
+          <w:sz w:val="24"/>
+          <w:szCs w:val="24"/>
+          <w:lang w:val="en-US"/>
+        </w:rPr>
+      </w:pPr>
+      <w:r>
+        <w:rPr>
+          <w:sz w:val="24"/>
+          <w:szCs w:val="24"/>
+          <w:lang w:val="en-US"/>
+        </w:rPr>
+        <w:t>If a token does not have the permission to delete a repo, then a 403 error is shown as the status code.</w:t>
+      </w:r>
+    </w:p>
+    <w:p>
+      <w:pPr>
+        <w:rPr>
+          <w:sz w:val="24"/>
+          <w:szCs w:val="24"/>
+          <w:lang w:val="en-US"/>
+        </w:rPr>
+      </w:pPr>
+      <w:r>
+        <w:rPr>
+          <w:sz w:val="24"/>
+          <w:szCs w:val="24"/>
+        </w:rPr>
+        <w:drawing>
+          <wp:inline distT="0" distB="0" distL="0" distR="0" wp14:anchorId="01E46351" wp14:editId="48DEA54E">
+            <wp:extent cx="5727700" cy="2673350"/>
+            <wp:effectExtent l="0" t="0" r="6350" b="0"/>
+            <wp:docPr id="1008702365" name="Picture 5"/>
+            <wp:cNvGraphicFramePr>
+              <a:graphicFrameLocks xmlns:a="http://schemas.openxmlformats.org/drawingml/2006/main" noChangeAspect="1"/>
+            </wp:cNvGraphicFramePr>
+            <a:graphic xmlns:a="http://schemas.openxmlformats.org/drawingml/2006/main">
+              <a:graphicData uri="http://schemas.openxmlformats.org/drawingml/2006/picture">
+                <pic:pic xmlns:pic="http://schemas.openxmlformats.org/drawingml/2006/picture">
+                  <pic:nvPicPr>
+                    <pic:cNvPr id="0" name="Picture 1"/>
+                    <pic:cNvPicPr>
+                      <a:picLocks noChangeAspect="1" noChangeArrowheads="1"/>
+                    </pic:cNvPicPr>
+                  </pic:nvPicPr>
+                  <pic:blipFill>
+                    <a:blip r:embed="rId13">
+                      <a:extLst>
+                        <a:ext uri="{28A0092B-C50C-407E-A947-70E740481C1C}">
+                          <a14:useLocalDpi xmlns:a14="http://schemas.microsoft.com/office/drawing/2010/main" val="0"/>
+                        </a:ext>
+                      </a:extLst>
+                    </a:blip>
+                    <a:srcRect/>
+                    <a:stretch>
+                      <a:fillRect/>
+                    </a:stretch>
+                  </pic:blipFill>
+                  <pic:spPr bwMode="auto">
+                    <a:xfrm>
+                      <a:off x="0" y="0"/>
+                      <a:ext cx="5727700" cy="2673350"/>
+                    </a:xfrm>
+                    <a:prstGeom prst="rect">
+                      <a:avLst/>
+                    </a:prstGeom>
+                    <a:noFill/>
+                    <a:ln>
+                      <a:noFill/>
+                    </a:ln>
+                  </pic:spPr>
+                </pic:pic>
+              </a:graphicData>
+            </a:graphic>
+          </wp:inline>
+        </w:drawing>
+      </w:r>
+    </w:p>
+    <w:p>
+      <w:pPr>
+        <w:rPr>
+          <w:sz w:val="24"/>
+          <w:szCs w:val="24"/>
+          <w:lang w:val="en-US"/>
+        </w:rPr>
+      </w:pPr>
+    </w:p>
+    <w:p>
+      <w:pPr>
+        <w:rPr>
+          <w:sz w:val="24"/>
+          <w:szCs w:val="24"/>
+          <w:lang w:val="en-US"/>
+        </w:rPr>
+      </w:pPr>
+    </w:p>
+    <w:p>
+      <w:pPr>
+        <w:rPr>
+          <w:sz w:val="24"/>
+          <w:szCs w:val="24"/>
+          <w:lang w:val="en-US"/>
+        </w:rPr>
+      </w:pPr>
+    </w:p>
+    <w:p>
+      <w:pPr>
+        <w:rPr>
+          <w:sz w:val="24"/>
+          <w:szCs w:val="24"/>
+        </w:rPr>
+      </w:pPr>
+    </w:p>
+    <w:p>
+      <w:pPr>
+        <w:rPr>
+          <w:sz w:val="24"/>
+          <w:szCs w:val="24"/>
+        </w:rPr>
+      </w:pPr>
+    </w:p>
+    <w:p>
+      <w:pPr>
+        <w:rPr>
+          <w:sz w:val="24"/>
+          <w:szCs w:val="24"/>
+        </w:rPr>
+      </w:pPr>
+    </w:p>
+    <w:p>
+      <w:pPr>
+        <w:rPr>
+          <w:sz w:val="24"/>
+          <w:szCs w:val="24"/>
+        </w:rPr>
+      </w:pPr>
+    </w:p>
     <w:sectPr>
       <w:pgSz w:w="11906" w:h="16838"/>
       <w:pgMar w:top="1440" w:right="1440" w:bottom="1440" w:left="1440" w:header="708" w:footer="708" w:gutter="0"/>
@@ -58,6 +1593,219 @@
     </w:sectPr>
   </w:body>
 </w:document>
+</file>
+
+<file path=word/numbering.xml><?xml version="1.0" encoding="utf-8"?>
+<w:numbering xmlns:wpc="http://schemas.microsoft.com/office/word/2010/wordprocessingCanvas" xmlns:cx="http://schemas.microsoft.com/office/drawing/2014/chartex" xmlns:cx1="http://schemas.microsoft.com/office/drawing/2015/9/8/chartex" xmlns:cx2="http://schemas.microsoft.com/office/drawing/2015/10/21/chartex" xmlns:cx3="http://schemas.microsoft.com/office/drawing/2016/5/9/chartex" xmlns:cx4="http://schemas.microsoft.com/office/drawing/2016/5/10/chartex" xmlns:cx5="http://schemas.microsoft.com/office/drawing/2016/5/11/chartex" xmlns:cx6="http://schemas.microsoft.com/office/drawing/2016/5/12/chartex" xmlns:cx7="http://schemas.microsoft.com/office/drawing/2016/5/13/chartex" xmlns:cx8="http://schemas.microsoft.com/office/drawing/2016/5/14/chartex" xmlns:mc="http://schemas.openxmlformats.org/markup-compatibility/2006" xmlns:aink="http://schemas.microsoft.com/office/drawing/2016/ink" xmlns:am3d="http://schemas.microsoft.com/office/drawing/2017/model3d" xmlns:o="urn:schemas-microsoft-com:office:office" xmlns:oel="http://schemas.microsoft.com/office/2019/extlst" xmlns:r="http://schemas.openxmlformats.org/officeDocument/2006/relationships" xmlns:m="http://schemas.openxmlformats.org/officeDocument/2006/math" xmlns:v="urn:schemas-microsoft-com:vml" xmlns:wp14="http://schemas.microsoft.com/office/word/2010/wordprocessingDrawing" xmlns:wp="http://schemas.openxmlformats.org/drawingml/2006/wordprocessingDrawing" xmlns:w10="urn:schemas-microsoft-com:office:word" xmlns:w="http://schemas.openxmlformats.org/wordprocessingml/2006/main" xmlns:w14="http://schemas.microsoft.com/office/word/2010/wordml" xmlns:w15="http://schemas.microsoft.com/office/word/2012/wordml" xmlns:w16cex="http://schemas.microsoft.com/office/word/2018/wordml/cex" xmlns:w16cid="http://schemas.microsoft.com/office/word/2016/wordml/cid" xmlns:w16="http://schemas.microsoft.com/office/word/2018/wordml" xmlns:w16du="http://schemas.microsoft.com/office/word/2023/wordml/word16du" xmlns:w16sdtdh="http://schemas.microsoft.com/office/word/2020/wordml/sdtdatahash" xmlns:w16sdtfl="http://schemas.microsoft.com/office/word/2024/wordml/sdtformatlock" xmlns:w16se="http://schemas.microsoft.com/office/word/2015/wordml/symex" xmlns:wpg="http://schemas.microsoft.com/office/word/2010/wordprocessingGroup" xmlns:wpi="http://schemas.microsoft.com/office/word/2010/wordprocessingInk" xmlns:wne="http://schemas.microsoft.com/office/word/2006/wordml" xmlns:wps="http://schemas.microsoft.com/office/word/2010/wordprocessingShape" mc:Ignorable="w14 w15 w16se w16cid w16 w16cex w16sdtdh w16sdtfl w16du wp14">
+  <w:abstractNum w:abstractNumId="0" w15:restartNumberingAfterBreak="0">
+    <w:nsid w:val="199525E7"/>
+    <w:multiLevelType w:val="hybridMultilevel"/>
+    <w:tmpl w:val="E5184CF6"/>
+    <w:lvl w:ilvl="0" w:tplc="4009000F">
+      <w:start w:val="1"/>
+      <w:numFmt w:val="decimal"/>
+      <w:lvlText w:val="%1."/>
+      <w:lvlJc w:val="left"/>
+      <w:pPr>
+        <w:ind w:left="720" w:hanging="360"/>
+      </w:pPr>
+    </w:lvl>
+    <w:lvl w:ilvl="1" w:tplc="40090019">
+      <w:start w:val="1"/>
+      <w:numFmt w:val="lowerLetter"/>
+      <w:lvlText w:val="%2."/>
+      <w:lvlJc w:val="left"/>
+      <w:pPr>
+        <w:ind w:left="1440" w:hanging="360"/>
+      </w:pPr>
+    </w:lvl>
+    <w:lvl w:ilvl="2" w:tplc="4009001B">
+      <w:start w:val="1"/>
+      <w:numFmt w:val="lowerRoman"/>
+      <w:lvlText w:val="%3."/>
+      <w:lvlJc w:val="right"/>
+      <w:pPr>
+        <w:ind w:left="2160" w:hanging="180"/>
+      </w:pPr>
+    </w:lvl>
+    <w:lvl w:ilvl="3" w:tplc="4009000F">
+      <w:start w:val="1"/>
+      <w:numFmt w:val="decimal"/>
+      <w:lvlText w:val="%4."/>
+      <w:lvlJc w:val="left"/>
+      <w:pPr>
+        <w:ind w:left="2880" w:hanging="360"/>
+      </w:pPr>
+    </w:lvl>
+    <w:lvl w:ilvl="4" w:tplc="40090019">
+      <w:start w:val="1"/>
+      <w:numFmt w:val="lowerLetter"/>
+      <w:lvlText w:val="%5."/>
+      <w:lvlJc w:val="left"/>
+      <w:pPr>
+        <w:ind w:left="3600" w:hanging="360"/>
+      </w:pPr>
+    </w:lvl>
+    <w:lvl w:ilvl="5" w:tplc="4009001B">
+      <w:start w:val="1"/>
+      <w:numFmt w:val="lowerRoman"/>
+      <w:lvlText w:val="%6."/>
+      <w:lvlJc w:val="right"/>
+      <w:pPr>
+        <w:ind w:left="4320" w:hanging="180"/>
+      </w:pPr>
+    </w:lvl>
+    <w:lvl w:ilvl="6" w:tplc="4009000F">
+      <w:start w:val="1"/>
+      <w:numFmt w:val="decimal"/>
+      <w:lvlText w:val="%7."/>
+      <w:lvlJc w:val="left"/>
+      <w:pPr>
+        <w:ind w:left="5040" w:hanging="360"/>
+      </w:pPr>
+    </w:lvl>
+    <w:lvl w:ilvl="7" w:tplc="40090019">
+      <w:start w:val="1"/>
+      <w:numFmt w:val="lowerLetter"/>
+      <w:lvlText w:val="%8."/>
+      <w:lvlJc w:val="left"/>
+      <w:pPr>
+        <w:ind w:left="5760" w:hanging="360"/>
+      </w:pPr>
+    </w:lvl>
+    <w:lvl w:ilvl="8" w:tplc="4009001B">
+      <w:start w:val="1"/>
+      <w:numFmt w:val="lowerRoman"/>
+      <w:lvlText w:val="%9."/>
+      <w:lvlJc w:val="right"/>
+      <w:pPr>
+        <w:ind w:left="6480" w:hanging="180"/>
+      </w:pPr>
+    </w:lvl>
+  </w:abstractNum>
+  <w:abstractNum w:abstractNumId="1" w15:restartNumberingAfterBreak="0">
+    <w:nsid w:val="75E778D5"/>
+    <w:multiLevelType w:val="hybridMultilevel"/>
+    <w:tmpl w:val="0276A992"/>
+    <w:lvl w:ilvl="0" w:tplc="4009000F">
+      <w:start w:val="1"/>
+      <w:numFmt w:val="decimal"/>
+      <w:lvlText w:val="%1."/>
+      <w:lvlJc w:val="left"/>
+      <w:pPr>
+        <w:ind w:left="720" w:hanging="360"/>
+      </w:pPr>
+      <w:rPr>
+        <w:rFonts w:hint="default"/>
+      </w:rPr>
+    </w:lvl>
+    <w:lvl w:ilvl="1" w:tplc="40090019">
+      <w:start w:val="1"/>
+      <w:numFmt w:val="lowerLetter"/>
+      <w:lvlText w:val="%2."/>
+      <w:lvlJc w:val="left"/>
+      <w:pPr>
+        <w:ind w:left="1440" w:hanging="360"/>
+      </w:pPr>
+    </w:lvl>
+    <w:lvl w:ilvl="2" w:tplc="4009001B">
+      <w:start w:val="1"/>
+      <w:numFmt w:val="lowerRoman"/>
+      <w:lvlText w:val="%3."/>
+      <w:lvlJc w:val="right"/>
+      <w:pPr>
+        <w:ind w:left="2160" w:hanging="180"/>
+      </w:pPr>
+    </w:lvl>
+    <w:lvl w:ilvl="3" w:tplc="4009000F" w:tentative="1">
+      <w:start w:val="1"/>
+      <w:numFmt w:val="decimal"/>
+      <w:lvlText w:val="%4."/>
+      <w:lvlJc w:val="left"/>
+      <w:pPr>
+        <w:ind w:left="2880" w:hanging="360"/>
+      </w:pPr>
+    </w:lvl>
+    <w:lvl w:ilvl="4" w:tplc="40090019" w:tentative="1">
+      <w:start w:val="1"/>
+      <w:numFmt w:val="lowerLetter"/>
+      <w:lvlText w:val="%5."/>
+      <w:lvlJc w:val="left"/>
+      <w:pPr>
+        <w:ind w:left="3600" w:hanging="360"/>
+      </w:pPr>
+    </w:lvl>
+    <w:lvl w:ilvl="5" w:tplc="4009001B" w:tentative="1">
+      <w:start w:val="1"/>
+      <w:numFmt w:val="lowerRoman"/>
+      <w:lvlText w:val="%6."/>
+      <w:lvlJc w:val="right"/>
+      <w:pPr>
+        <w:ind w:left="4320" w:hanging="180"/>
+      </w:pPr>
+    </w:lvl>
+    <w:lvl w:ilvl="6" w:tplc="4009000F" w:tentative="1">
+      <w:start w:val="1"/>
+      <w:numFmt w:val="decimal"/>
+      <w:lvlText w:val="%7."/>
+      <w:lvlJc w:val="left"/>
+      <w:pPr>
+        <w:ind w:left="5040" w:hanging="360"/>
+      </w:pPr>
+    </w:lvl>
+    <w:lvl w:ilvl="7" w:tplc="40090019" w:tentative="1">
+      <w:start w:val="1"/>
+      <w:numFmt w:val="lowerLetter"/>
+      <w:lvlText w:val="%8."/>
+      <w:lvlJc w:val="left"/>
+      <w:pPr>
+        <w:ind w:left="5760" w:hanging="360"/>
+      </w:pPr>
+    </w:lvl>
+    <w:lvl w:ilvl="8" w:tplc="4009001B" w:tentative="1">
+      <w:start w:val="1"/>
+      <w:numFmt w:val="lowerRoman"/>
+      <w:lvlText w:val="%9."/>
+      <w:lvlJc w:val="right"/>
+      <w:pPr>
+        <w:ind w:left="6480" w:hanging="180"/>
+      </w:pPr>
+    </w:lvl>
+  </w:abstractNum>
+  <w:num w:numId="1" w16cid:durableId="1545867231">
+    <w:abstractNumId w:val="1"/>
+  </w:num>
+  <w:num w:numId="2" w16cid:durableId="1631780948">
+    <w:abstractNumId w:val="0"/>
+    <w:lvlOverride w:ilvl="0">
+      <w:startOverride w:val="1"/>
+    </w:lvlOverride>
+    <w:lvlOverride w:ilvl="1">
+      <w:startOverride w:val="1"/>
+    </w:lvlOverride>
+    <w:lvlOverride w:ilvl="2">
+      <w:startOverride w:val="1"/>
+    </w:lvlOverride>
+    <w:lvlOverride w:ilvl="3">
+      <w:startOverride w:val="1"/>
+    </w:lvlOverride>
+    <w:lvlOverride w:ilvl="4">
+      <w:startOverride w:val="1"/>
+    </w:lvlOverride>
+    <w:lvlOverride w:ilvl="5">
+      <w:startOverride w:val="1"/>
+    </w:lvlOverride>
+    <w:lvlOverride w:ilvl="6">
+      <w:startOverride w:val="1"/>
+    </w:lvlOverride>
+    <w:lvlOverride w:ilvl="7">
+      <w:startOverride w:val="1"/>
+    </w:lvlOverride>
+    <w:lvlOverride w:ilvl="8">
+      <w:startOverride w:val="1"/>
+    </w:lvlOverride>
+  </w:num>
+</w:numbering>
 </file>
 
 <file path=word/styles.xml><?xml version="1.0" encoding="utf-8"?>
@@ -663,7 +2411,6 @@
   <w:style w:type="character" w:default="1" w:styleId="DefaultParagraphFont">
     <w:name w:val="Default Paragraph Font"/>
     <w:uiPriority w:val="1"/>
-    <w:semiHidden/>
     <w:unhideWhenUsed/>
   </w:style>
   <w:style w:type="table" w:default="1" w:styleId="TableNormal">
@@ -975,6 +2722,19 @@
       <w:smallCaps/>
       <w:color w:val="0F4761" w:themeColor="accent1" w:themeShade="BF"/>
       <w:spacing w:val="5"/>
+    </w:rPr>
+  </w:style>
+  <w:style w:type="paragraph" w:styleId="NormalWeb">
+    <w:name w:val="Normal (Web)"/>
+    <w:basedOn w:val="Normal"/>
+    <w:uiPriority w:val="99"/>
+    <w:semiHidden/>
+    <w:unhideWhenUsed/>
+    <w:rsid w:val="004C2715"/>
+    <w:rPr>
+      <w:rFonts w:ascii="Times New Roman" w:hAnsi="Times New Roman" w:cs="Times New Roman"/>
+      <w:sz w:val="24"/>
+      <w:szCs w:val="24"/>
     </w:rPr>
   </w:style>
 </w:styles>

</xml_diff>